<commit_message>
Feat: Implement Preface page with Thai Distributed alignment and fix cover page overflow
</commit_message>
<xml_diff>
--- a/assets/templates/template_academic_general.docx
+++ b/assets/templates/template_academic_general.docx
@@ -42,6 +42,33 @@
     </w:p>
     <w:p>
       <w:pPr>
+        <w:rPr>
+          <w:rFonts w:ascii="Angsana New" w:hAnsi="Angsana New" w:eastAsia="Angsana New" w:cs="Angsana New"/>
+          <w:sz w:val="36"/>
+          <w:szCs w:val="36"/>
+        </w:rPr>
+      </w:pPr>
+    </w:p>
+    <w:p>
+      <w:pPr>
+        <w:rPr>
+          <w:rFonts w:ascii="Angsana New" w:hAnsi="Angsana New" w:eastAsia="Angsana New" w:cs="Angsana New"/>
+          <w:sz w:val="36"/>
+          <w:szCs w:val="36"/>
+        </w:rPr>
+      </w:pPr>
+    </w:p>
+    <w:p>
+      <w:pPr>
+        <w:rPr>
+          <w:rFonts w:ascii="Angsana New" w:hAnsi="Angsana New" w:eastAsia="Angsana New" w:cs="Angsana New"/>
+          <w:sz w:val="36"/>
+          <w:szCs w:val="36"/>
+        </w:rPr>
+      </w:pPr>
+    </w:p>
+    <w:p>
+      <w:pPr>
         <w:pStyle w:val="CoverPara"/>
       </w:pPr>
       <w:r>
@@ -91,6 +118,33 @@
     </w:p>
     <w:p>
       <w:pPr>
+        <w:rPr>
+          <w:rFonts w:ascii="Angsana New" w:hAnsi="Angsana New" w:eastAsia="Angsana New" w:cs="Angsana New"/>
+          <w:sz w:val="36"/>
+          <w:szCs w:val="36"/>
+        </w:rPr>
+      </w:pPr>
+    </w:p>
+    <w:p>
+      <w:pPr>
+        <w:rPr>
+          <w:rFonts w:ascii="Angsana New" w:hAnsi="Angsana New" w:eastAsia="Angsana New" w:cs="Angsana New"/>
+          <w:sz w:val="36"/>
+          <w:szCs w:val="36"/>
+        </w:rPr>
+      </w:pPr>
+    </w:p>
+    <w:p>
+      <w:pPr>
+        <w:rPr>
+          <w:rFonts w:ascii="Angsana New" w:hAnsi="Angsana New" w:eastAsia="Angsana New" w:cs="Angsana New"/>
+          <w:sz w:val="36"/>
+          <w:szCs w:val="36"/>
+        </w:rPr>
+      </w:pPr>
+    </w:p>
+    <w:p>
+      <w:pPr>
         <w:pStyle w:val="CoverPara"/>
       </w:pPr>
       <w:r>
@@ -134,9 +188,13 @@
       </w:r>
     </w:p>
     <w:p>
-      <w:r>
-        <w:br w:type="page"/>
-      </w:r>
+      <w:pPr>
+        <w:sectPr>
+          <w:pgSz w:orient="portrait" w:w="11905.511811023621703498065471649169921875" w:h="16837.7952755905498634092509746551513671875"/>
+          <w:pgMar w:top="2160" w:right="1440" w:bottom="1440" w:left="2160" w:header="720" w:footer="720" w:gutter="0"/>
+          <w:cols w:num="1" w:space="720"/>
+        </w:sectPr>
+      </w:pPr>
     </w:p>
     <w:p>
       <w:pPr>
@@ -178,6 +236,33 @@
     </w:p>
     <w:p>
       <w:pPr>
+        <w:rPr>
+          <w:rFonts w:ascii="Angsana New" w:hAnsi="Angsana New" w:eastAsia="Angsana New" w:cs="Angsana New"/>
+          <w:sz w:val="36"/>
+          <w:szCs w:val="36"/>
+        </w:rPr>
+      </w:pPr>
+    </w:p>
+    <w:p>
+      <w:pPr>
+        <w:rPr>
+          <w:rFonts w:ascii="Angsana New" w:hAnsi="Angsana New" w:eastAsia="Angsana New" w:cs="Angsana New"/>
+          <w:sz w:val="36"/>
+          <w:szCs w:val="36"/>
+        </w:rPr>
+      </w:pPr>
+    </w:p>
+    <w:p>
+      <w:pPr>
+        <w:rPr>
+          <w:rFonts w:ascii="Angsana New" w:hAnsi="Angsana New" w:eastAsia="Angsana New" w:cs="Angsana New"/>
+          <w:sz w:val="36"/>
+          <w:szCs w:val="36"/>
+        </w:rPr>
+      </w:pPr>
+    </w:p>
+    <w:p>
+      <w:pPr>
         <w:pStyle w:val="CoverPara"/>
       </w:pPr>
       <w:r>
@@ -227,6 +312,33 @@
     </w:p>
     <w:p>
       <w:pPr>
+        <w:rPr>
+          <w:rFonts w:ascii="Angsana New" w:hAnsi="Angsana New" w:eastAsia="Angsana New" w:cs="Angsana New"/>
+          <w:sz w:val="36"/>
+          <w:szCs w:val="36"/>
+        </w:rPr>
+      </w:pPr>
+    </w:p>
+    <w:p>
+      <w:pPr>
+        <w:rPr>
+          <w:rFonts w:ascii="Angsana New" w:hAnsi="Angsana New" w:eastAsia="Angsana New" w:cs="Angsana New"/>
+          <w:sz w:val="36"/>
+          <w:szCs w:val="36"/>
+        </w:rPr>
+      </w:pPr>
+    </w:p>
+    <w:p>
+      <w:pPr>
+        <w:rPr>
+          <w:rFonts w:ascii="Angsana New" w:hAnsi="Angsana New" w:eastAsia="Angsana New" w:cs="Angsana New"/>
+          <w:sz w:val="36"/>
+          <w:szCs w:val="36"/>
+        </w:rPr>
+      </w:pPr>
+    </w:p>
+    <w:p>
+      <w:pPr>
         <w:pStyle w:val="CoverPara"/>
       </w:pPr>
       <w:r>
@@ -267,6 +379,89 @@
           <w:rStyle w:val="CoverFont"/>
         </w:rPr>
         <w:t xml:space="preserve">ภาคการศึกษาที่ ${report_semester} ปีการศึกษา ${report_year}</w:t>
+      </w:r>
+    </w:p>
+    <w:p>
+      <w:pPr>
+        <w:sectPr>
+          <w:pgSz w:orient="portrait" w:w="11905.511811023621703498065471649169921875" w:h="16837.7952755905498634092509746551513671875"/>
+          <w:pgMar w:top="2160" w:right="1440" w:bottom="1440" w:left="2160" w:header="720" w:footer="720" w:gutter="0"/>
+          <w:cols w:num="1" w:space="720"/>
+        </w:sectPr>
+      </w:pPr>
+    </w:p>
+    <w:p>
+      <w:pPr>
+        <w:pStyle w:val="PrefaceParaTitle"/>
+      </w:pPr>
+      <w:r>
+        <w:rPr>
+          <w:rStyle w:val="PrefaceTitleFont"/>
+        </w:rPr>
+        <w:t xml:space="preserve">คำนำ</w:t>
+      </w:r>
+    </w:p>
+    <w:p>
+      <w:pPr>
+        <w:rPr>
+          <w:sz w:val="32"/>
+          <w:szCs w:val="32"/>
+        </w:rPr>
+      </w:pPr>
+    </w:p>
+    <w:p>
+      <w:pPr/>
+      <w:r>
+        <w:rPr/>
+        <w:t xml:space="preserve">${preface_paragraphs}</w:t>
+      </w:r>
+    </w:p>
+    <w:p>
+      <w:pPr>
+        <w:pStyle w:val="PrefaceParaContent"/>
+      </w:pPr>
+      <w:r>
+        <w:rPr>
+          <w:rStyle w:val="PrefaceContentFont"/>
+        </w:rPr>
+        <w:t xml:space="preserve">${preface_content}</w:t>
+      </w:r>
+    </w:p>
+    <w:p>
+      <w:pPr/>
+      <w:r>
+        <w:rPr/>
+        <w:t xml:space="preserve">${/preface_paragraphs}</w:t>
+      </w:r>
+    </w:p>
+    <w:p>
+      <w:pPr>
+        <w:rPr>
+          <w:sz w:val="32"/>
+          <w:szCs w:val="32"/>
+        </w:rPr>
+      </w:pPr>
+    </w:p>
+    <w:p>
+      <w:pPr>
+        <w:pStyle w:val="PrefaceParaSign"/>
+      </w:pPr>
+      <w:r>
+        <w:rPr>
+          <w:rStyle w:val="PrefaceContentFont"/>
+        </w:rPr>
+        <w:t xml:space="preserve">${preface_signer}</w:t>
+      </w:r>
+    </w:p>
+    <w:p>
+      <w:pPr>
+        <w:pStyle w:val="PrefaceParaSign"/>
+      </w:pPr>
+      <w:r>
+        <w:rPr>
+          <w:rStyle w:val="PrefaceContentFont"/>
+        </w:rPr>
+        <w:t xml:space="preserve">${preface_date}</w:t>
       </w:r>
     </w:p>
     <w:p>
@@ -443,6 +638,34 @@
       <w:spacing w:line="240" w:lineRule="auto"/>
     </w:pPr>
   </w:style>
+  <w:style w:type="paragraph" w:customStyle="1" w:styleId="PrefaceParaTitle">
+    <w:name w:val="PrefaceParaTitle"/>
+    <w:basedOn w:val="Normal"/>
+    <w:pPr>
+      <w:jc w:val="center"/>
+      <w:spacing w:line="240" w:lineRule="auto"/>
+    </w:pPr>
+  </w:style>
+  <w:style w:type="paragraph" w:customStyle="1" w:styleId="PrefaceParaContent">
+    <w:name w:val="PrefaceParaContent"/>
+    <w:basedOn w:val="Normal"/>
+    <w:pPr>
+      <w:jc w:val="thaiDistribute"/>
+      <w:ind w:left="0" w:right="0" w:firstLine="1440" w:hanging="0"/>
+      <w:spacing w:line="240" w:lineRule="auto"/>
+      <w:tabs>
+        <w:tab w:val="left" w:leader="none" w:pos="1440"/>
+      </w:tabs>
+    </w:pPr>
+  </w:style>
+  <w:style w:type="paragraph" w:customStyle="1" w:styleId="PrefaceParaSign">
+    <w:name w:val="PrefaceParaSign"/>
+    <w:basedOn w:val="Normal"/>
+    <w:pPr>
+      <w:jc w:val="right"/>
+      <w:spacing w:line="240" w:lineRule="auto"/>
+    </w:pPr>
+  </w:style>
   <w:style w:type="character">
     <w:name w:val="Heading1Font"/>
     <w:rPr>
@@ -483,6 +706,28 @@
       <w:lang w:val="th-TH" w:eastAsia="th-TH" w:bidi="th-TH"/>
       <w:sz w:val="32"/>
       <w:szCs w:val="32"/>
+    </w:rPr>
+  </w:style>
+  <w:style w:type="character">
+    <w:name w:val="PrefaceTitleFont"/>
+    <w:rPr>
+      <w:rFonts w:ascii="Angsana New" w:hAnsi="Angsana New" w:eastAsia="Angsana New" w:cs="Angsana New" w:hint="cs"/>
+      <w:lang w:val="th-TH" w:eastAsia="th-TH" w:bidi="th-TH"/>
+      <w:sz w:val="40"/>
+      <w:szCs w:val="40"/>
+      <w:b w:val="1"/>
+      <w:bCs w:val="1"/>
+    </w:rPr>
+  </w:style>
+  <w:style w:type="character">
+    <w:name w:val="PrefaceContentFont"/>
+    <w:rPr>
+      <w:rFonts w:ascii="Angsana New" w:hAnsi="Angsana New" w:eastAsia="Angsana New" w:cs="Angsana New" w:hint="cs"/>
+      <w:lang w:val="th-TH" w:eastAsia="th-TH" w:bidi="th-TH"/>
+      <w:sz w:val="32"/>
+      <w:szCs w:val="32"/>
+      <w:b w:val="0"/>
+      <w:bCs w:val="0"/>
     </w:rPr>
   </w:style>
 </w:styles>

</xml_diff>

<commit_message>
Refactor: Adjust preface indentation to 0.5 inch and add Thai text normalization logic in exporter
</commit_message>
<xml_diff>
--- a/assets/templates/template_academic_general.docx
+++ b/assets/templates/template_academic_general.docx
@@ -190,7 +190,7 @@
     <w:p>
       <w:pPr>
         <w:sectPr>
-          <w:pgSz w:orient="portrait" w:w="11905.511811023621703498065471649169921875" w:h="16837.7952755905498634092509746551513671875"/>
+          <w:pgSz w:orient="portrait" w:w="11905.511811023622" w:h="16837.79527559055"/>
           <w:pgMar w:top="2160" w:right="1440" w:bottom="1440" w:left="2160" w:header="720" w:footer="720" w:gutter="0"/>
           <w:cols w:num="1" w:space="720"/>
         </w:sectPr>
@@ -384,7 +384,7 @@
     <w:p>
       <w:pPr>
         <w:sectPr>
-          <w:pgSz w:orient="portrait" w:w="11905.511811023621703498065471649169921875" w:h="16837.7952755905498634092509746551513671875"/>
+          <w:pgSz w:orient="portrait" w:w="11905.511811023622" w:h="16837.79527559055"/>
           <w:pgMar w:top="2160" w:right="1440" w:bottom="1440" w:left="2160" w:header="720" w:footer="720" w:gutter="0"/>
           <w:cols w:num="1" w:space="720"/>
         </w:sectPr>
@@ -577,7 +577,7 @@
       </w:r>
     </w:p>
     <w:sectPr>
-      <w:pgSz w:orient="portrait" w:w="11905.511811023621703498065471649169921875" w:h="16837.7952755905498634092509746551513671875"/>
+      <w:pgSz w:orient="portrait" w:w="11905.511811023622" w:h="16837.79527559055"/>
       <w:pgMar w:top="2160" w:right="1440" w:bottom="1440" w:left="2160" w:header="720" w:footer="720" w:gutter="0"/>
       <w:cols w:num="1" w:space="720"/>
     </w:sectPr>
@@ -651,11 +651,8 @@
     <w:basedOn w:val="Normal"/>
     <w:pPr>
       <w:jc w:val="thaiDistribute"/>
-      <w:ind w:left="0" w:right="0" w:firstLine="1440" w:hanging="0"/>
+      <w:ind w:left="0" w:right="0" w:firstLine="720" w:hanging="0"/>
       <w:spacing w:line="240" w:lineRule="auto"/>
-      <w:tabs>
-        <w:tab w:val="left" w:leader="none" w:pos="1440"/>
-      </w:tabs>
     </w:pPr>
   </w:style>
   <w:style w:type="paragraph" w:customStyle="1" w:styleId="PrefaceParaSign">

</xml_diff>

<commit_message>
Feat: Complete Table of Contents (TOC) implementation with page mapping and styling
</commit_message>
<xml_diff>
--- a/assets/templates/template_academic_general.docx
+++ b/assets/templates/template_academic_general.docx
@@ -190,7 +190,7 @@
     <w:p>
       <w:pPr>
         <w:sectPr>
-          <w:pgSz w:orient="portrait" w:w="11905.511811023622" w:h="16837.79527559055"/>
+          <w:pgSz w:orient="portrait" w:w="11905.511811023621703498065471649169921875" w:h="16837.7952755905498634092509746551513671875"/>
           <w:pgMar w:top="2160" w:right="1440" w:bottom="1440" w:left="2160" w:header="720" w:footer="720" w:gutter="0"/>
           <w:cols w:num="1" w:space="720"/>
         </w:sectPr>
@@ -384,7 +384,7 @@
     <w:p>
       <w:pPr>
         <w:sectPr>
-          <w:pgSz w:orient="portrait" w:w="11905.511811023622" w:h="16837.79527559055"/>
+          <w:pgSz w:orient="portrait" w:w="11905.511811023621703498065471649169921875" w:h="16837.7952755905498634092509746551513671875"/>
           <w:pgMar w:top="2160" w:right="1440" w:bottom="1440" w:left="2160" w:header="720" w:footer="720" w:gutter="0"/>
           <w:cols w:num="1" w:space="720"/>
         </w:sectPr>
@@ -462,6 +462,116 @@
           <w:rStyle w:val="PrefaceContentFont"/>
         </w:rPr>
         <w:t xml:space="preserve">${preface_date}</w:t>
+      </w:r>
+    </w:p>
+    <w:p>
+      <w:r>
+        <w:br w:type="page"/>
+      </w:r>
+    </w:p>
+    <w:p>
+      <w:pPr>
+        <w:pStyle w:val="TOCParaTitle"/>
+      </w:pPr>
+      <w:r>
+        <w:rPr>
+          <w:rStyle w:val="PrefaceTitleFont"/>
+        </w:rPr>
+        <w:t xml:space="preserve">สารบัญ</w:t>
+      </w:r>
+    </w:p>
+    <w:p>
+      <w:pPr>
+        <w:pStyle w:val="TOCParaLabel"/>
+      </w:pPr>
+      <w:r>
+        <w:rPr>
+          <w:rStyle w:val="TOCLabelFont"/>
+        </w:rPr>
+        <w:t xml:space="preserve">หน้า</w:t>
+      </w:r>
+    </w:p>
+    <w:p>
+      <w:pPr>
+        <w:pStyle w:val="TOCParaItem"/>
+      </w:pPr>
+      <w:r>
+        <w:rPr>
+          <w:rStyle w:val="PrefaceContentFont"/>
+        </w:rPr>
+        <w:t xml:space="preserve">คำนำ	${toc_page_preface}</w:t>
+      </w:r>
+    </w:p>
+    <w:p>
+      <w:pPr/>
+      <w:r>
+        <w:rPr/>
+        <w:t xml:space="preserve">${toc_chapters}</w:t>
+      </w:r>
+    </w:p>
+    <w:p>
+      <w:pPr>
+        <w:pStyle w:val="TOCParaItem"/>
+      </w:pPr>
+      <w:r>
+        <w:rPr>
+          <w:rStyle w:val="PrefaceContentFont"/>
+        </w:rPr>
+        <w:t xml:space="preserve">บทที่ ${toc_chapter_number} ${toc_chapter_title}	${toc_chapter_page}</w:t>
+      </w:r>
+    </w:p>
+    <w:p>
+      <w:pPr/>
+      <w:r>
+        <w:rPr/>
+        <w:t xml:space="preserve">${toc_subsections}</w:t>
+      </w:r>
+    </w:p>
+    <w:p>
+      <w:pPr>
+        <w:pStyle w:val="TOCParaSubItem"/>
+      </w:pPr>
+      <w:r>
+        <w:rPr>
+          <w:rStyle w:val="PrefaceContentFont"/>
+        </w:rPr>
+        <w:t xml:space="preserve">${toc_subsection_number} ${toc_subsection_title}	${toc_subsection_page}</w:t>
+      </w:r>
+    </w:p>
+    <w:p>
+      <w:pPr/>
+      <w:r>
+        <w:rPr/>
+        <w:t xml:space="preserve">${/toc_subsections}</w:t>
+      </w:r>
+    </w:p>
+    <w:p>
+      <w:pPr/>
+      <w:r>
+        <w:rPr/>
+        <w:t xml:space="preserve">${/toc_chapters}</w:t>
+      </w:r>
+    </w:p>
+    <w:p>
+      <w:pPr>
+        <w:pStyle w:val="TOCParaItem"/>
+      </w:pPr>
+      <w:r>
+        <w:rPr>
+          <w:rStyle w:val="PrefaceContentFont"/>
+        </w:rPr>
+        <w:t xml:space="preserve">บรรณานุกรม	${toc_page_bib}</w:t>
+      </w:r>
+    </w:p>
+    <w:p>
+      <w:pPr>
+        <w:pStyle w:val="TOCParaItem"/>
+      </w:pPr>
+      <w:r>
+        <w:rPr>
+          <w:rStyle w:val="PrefaceContentFont"/>
+        </w:rPr>
+        <w:t xml:space="preserve">ภาคผนวก	${toc_page_app}</w:t>
       </w:r>
     </w:p>
     <w:p>
@@ -577,7 +687,7 @@
       </w:r>
     </w:p>
     <w:sectPr>
-      <w:pgSz w:orient="portrait" w:w="11905.511811023622" w:h="16837.79527559055"/>
+      <w:pgSz w:orient="portrait" w:w="11905.511811023621703498065471649169921875" w:h="16837.7952755905498634092509746551513671875"/>
       <w:pgMar w:top="2160" w:right="1440" w:bottom="1440" w:left="2160" w:header="720" w:footer="720" w:gutter="0"/>
       <w:cols w:num="1" w:space="720"/>
     </w:sectPr>
@@ -663,6 +773,45 @@
       <w:spacing w:line="240" w:lineRule="auto"/>
     </w:pPr>
   </w:style>
+  <w:style w:type="paragraph" w:customStyle="1" w:styleId="TOCParaTitle">
+    <w:name w:val="TOCParaTitle"/>
+    <w:basedOn w:val="Normal"/>
+    <w:pPr>
+      <w:jc w:val="center"/>
+      <w:spacing w:line="240" w:lineRule="auto"/>
+    </w:pPr>
+  </w:style>
+  <w:style w:type="paragraph" w:customStyle="1" w:styleId="TOCParaLabel">
+    <w:name w:val="TOCParaLabel"/>
+    <w:basedOn w:val="Normal"/>
+    <w:pPr>
+      <w:jc w:val="right"/>
+      <w:spacing w:line="240" w:lineRule="auto"/>
+    </w:pPr>
+  </w:style>
+  <w:style w:type="paragraph" w:customStyle="1" w:styleId="TOCParaItem">
+    <w:name w:val="TOCParaItem"/>
+    <w:basedOn w:val="Normal"/>
+    <w:pPr>
+      <w:jc w:val="left"/>
+      <w:spacing w:line="240" w:lineRule="auto"/>
+      <w:tabs>
+        <w:tab w:val="right" w:leader="none" w:pos="8200"/>
+      </w:tabs>
+    </w:pPr>
+  </w:style>
+  <w:style w:type="paragraph" w:customStyle="1" w:styleId="TOCParaSubItem">
+    <w:name w:val="TOCParaSubItem"/>
+    <w:basedOn w:val="Normal"/>
+    <w:pPr>
+      <w:jc w:val="left"/>
+      <w:ind w:left="360" w:right="0" w:firstLine="0" w:hanging="0"/>
+      <w:spacing w:line="240" w:lineRule="auto"/>
+      <w:tabs>
+        <w:tab w:val="right" w:leader="none" w:pos="8200"/>
+      </w:tabs>
+    </w:pPr>
+  </w:style>
   <w:style w:type="character">
     <w:name w:val="Heading1Font"/>
     <w:rPr>
@@ -725,6 +874,17 @@
       <w:szCs w:val="32"/>
       <w:b w:val="0"/>
       <w:bCs w:val="0"/>
+    </w:rPr>
+  </w:style>
+  <w:style w:type="character">
+    <w:name w:val="TOCLabelFont"/>
+    <w:rPr>
+      <w:rFonts w:ascii="Angsana New" w:hAnsi="Angsana New" w:eastAsia="Angsana New" w:cs="Angsana New" w:hint="cs"/>
+      <w:lang w:val="th-TH" w:eastAsia="th-TH" w:bidi="th-TH"/>
+      <w:sz w:val="36"/>
+      <w:szCs w:val="36"/>
+      <w:b w:val="1"/>
+      <w:bCs w:val="1"/>
     </w:rPr>
   </w:style>
 </w:styles>

</xml_diff>

<commit_message>
Feat: Implement Chapter 1 styling (20pt bold) and update web preview sample data with sections
</commit_message>
<xml_diff>
--- a/assets/templates/template_academic_general.docx
+++ b/assets/templates/template_academic_general.docx
@@ -618,6 +618,14 @@
         </w:rPr>
         <w:t xml:space="preserve">${chapter_title}</w:t>
       </w:r>
+    </w:p>
+    <w:p>
+      <w:pPr>
+        <w:rPr>
+          <w:sz w:val="32"/>
+          <w:szCs w:val="32"/>
+        </w:rPr>
+      </w:pPr>
     </w:p>
     <w:p>
       <w:pPr/>
@@ -817,8 +825,8 @@
     <w:rPr>
       <w:rFonts w:ascii="Angsana New" w:hAnsi="Angsana New" w:eastAsia="Angsana New" w:cs="Angsana New" w:hint="cs"/>
       <w:lang w:val="th-TH" w:eastAsia="th-TH" w:bidi="th-TH"/>
-      <w:sz w:val="36"/>
-      <w:szCs w:val="36"/>
+      <w:sz w:val="40"/>
+      <w:szCs w:val="40"/>
       <w:b w:val="1"/>
       <w:bCs w:val="1"/>
     </w:rPr>

</xml_diff>

<commit_message>
Feat: Perfect TOC alignment, tighten cover spacing, and sync web preview with DOCX export standards
</commit_message>
<xml_diff>
--- a/assets/templates/template_academic_general.docx
+++ b/assets/templates/template_academic_general.docx
@@ -60,15 +60,6 @@
     </w:p>
     <w:p>
       <w:pPr>
-        <w:rPr>
-          <w:rFonts w:ascii="Angsana New" w:hAnsi="Angsana New" w:eastAsia="Angsana New" w:cs="Angsana New"/>
-          <w:sz w:val="36"/>
-          <w:szCs w:val="36"/>
-        </w:rPr>
-      </w:pPr>
-    </w:p>
-    <w:p>
-      <w:pPr>
         <w:pStyle w:val="CoverPara"/>
       </w:pPr>
       <w:r>
@@ -88,15 +79,6 @@
         </w:rPr>
         <w:t xml:space="preserve">${report_student_ids}</w:t>
       </w:r>
-    </w:p>
-    <w:p>
-      <w:pPr>
-        <w:rPr>
-          <w:rFonts w:ascii="Angsana New" w:hAnsi="Angsana New" w:eastAsia="Angsana New" w:cs="Angsana New"/>
-          <w:sz w:val="36"/>
-          <w:szCs w:val="36"/>
-        </w:rPr>
-      </w:pPr>
     </w:p>
     <w:p>
       <w:pPr>
@@ -254,15 +236,6 @@
     </w:p>
     <w:p>
       <w:pPr>
-        <w:rPr>
-          <w:rFonts w:ascii="Angsana New" w:hAnsi="Angsana New" w:eastAsia="Angsana New" w:cs="Angsana New"/>
-          <w:sz w:val="36"/>
-          <w:szCs w:val="36"/>
-        </w:rPr>
-      </w:pPr>
-    </w:p>
-    <w:p>
-      <w:pPr>
         <w:pStyle w:val="CoverPara"/>
       </w:pPr>
       <w:r>
@@ -282,15 +255,6 @@
         </w:rPr>
         <w:t xml:space="preserve">${report_student_ids}</w:t>
       </w:r>
-    </w:p>
-    <w:p>
-      <w:pPr>
-        <w:rPr>
-          <w:rFonts w:ascii="Angsana New" w:hAnsi="Angsana New" w:eastAsia="Angsana New" w:cs="Angsana New"/>
-          <w:sz w:val="36"/>
-          <w:szCs w:val="36"/>
-        </w:rPr>
-      </w:pPr>
     </w:p>
     <w:p>
       <w:pPr>
@@ -580,17 +544,6 @@
       </w:r>
     </w:p>
     <w:p>
-      <w:pPr>
-        <w:pStyle w:val="CoverPara"/>
-      </w:pPr>
-      <w:r>
-        <w:rPr>
-          <w:rStyle w:val="CoverFont"/>
-        </w:rPr>
-        <w:t xml:space="preserve">หน้า 2 (โครงสร้างที่จะโคลน)</w:t>
-      </w:r>
-    </w:p>
-    <w:p>
       <w:pPr/>
       <w:r>
         <w:rPr/>
@@ -642,41 +595,113 @@
         <w:rPr>
           <w:rFonts w:ascii="Angsana New" w:hAnsi="Angsana New" w:eastAsia="Angsana New" w:cs="Angsana New" w:hint="cs"/>
           <w:lang w:val="th-TH" w:eastAsia="th-TH" w:bidi="th-TH"/>
+          <w:sz w:val="36"/>
+          <w:szCs w:val="36"/>
+          <w:b w:val="1"/>
+          <w:bCs w:val="1"/>
+        </w:rPr>
+        <w:t xml:space="preserve">${subsection_number} ${subsection_title}</w:t>
+      </w:r>
+    </w:p>
+    <w:p>
+      <w:pPr>
+        <w:pStyle w:val="AcademicBody"/>
+      </w:pPr>
+      <w:r>
+        <w:rPr>
+          <w:rStyle w:val="NormalFont"/>
+        </w:rPr>
+        <w:t xml:space="preserve">${subsection_content1}</w:t>
+      </w:r>
+    </w:p>
+    <w:p>
+      <w:pPr>
+        <w:pStyle w:val="AcademicBodyNoIndent"/>
+      </w:pPr>
+      <w:r>
+        <w:rPr>
+          <w:rStyle w:val="NormalFont"/>
+        </w:rPr>
+        <w:t xml:space="preserve">${subsection_content2}</w:t>
+      </w:r>
+    </w:p>
+    <w:p>
+      <w:pPr/>
+      <w:r>
+        <w:rPr/>
+        <w:t xml:space="preserve">${/subsections}</w:t>
+      </w:r>
+    </w:p>
+    <w:p>
+      <w:r>
+        <w:br w:type="page"/>
+      </w:r>
+    </w:p>
+    <w:p>
+      <w:pPr/>
+      <w:r>
+        <w:rPr/>
+        <w:t xml:space="preserve">${/chapters}</w:t>
+      </w:r>
+    </w:p>
+    <w:p>
+      <w:pPr>
+        <w:pStyle w:val="PrefaceParaTitle"/>
+      </w:pPr>
+      <w:r>
+        <w:rPr>
+          <w:rStyle w:val="PrefaceTitleFont"/>
+        </w:rPr>
+        <w:t xml:space="preserve">บรรณานุกรม</w:t>
+      </w:r>
+    </w:p>
+    <w:p>
+      <w:pPr>
+        <w:rPr>
           <w:sz w:val="32"/>
           <w:szCs w:val="32"/>
-          <w:b w:val="1"/>
-          <w:bCs w:val="1"/>
-        </w:rPr>
-        <w:t xml:space="preserve">${subsection_number} ${subsection_title}</w:t>
-      </w:r>
-    </w:p>
-    <w:p>
-      <w:pPr>
-        <w:pStyle w:val="Normal"/>
+        </w:rPr>
+      </w:pPr>
+    </w:p>
+    <w:p>
+      <w:pPr/>
+      <w:r>
+        <w:rPr/>
+        <w:t xml:space="preserve">${bibliography_entries}</w:t>
+      </w:r>
+    </w:p>
+    <w:p>
+      <w:pPr>
+        <w:pStyle w:val="AcademicBody"/>
       </w:pPr>
       <w:r>
         <w:rPr>
           <w:rStyle w:val="NormalFont"/>
         </w:rPr>
-        <w:t xml:space="preserve">${subsection_placeholder1}</w:t>
-      </w:r>
-    </w:p>
-    <w:p>
-      <w:pPr>
-        <w:pStyle w:val="Normal"/>
-      </w:pPr>
-      <w:r>
-        <w:rPr>
-          <w:rStyle w:val="NormalFont"/>
-        </w:rPr>
-        <w:t xml:space="preserve">${subsection_placeholder2}</w:t>
+        <w:t xml:space="preserve">${bib_content}</w:t>
       </w:r>
     </w:p>
     <w:p>
       <w:pPr/>
       <w:r>
         <w:rPr/>
-        <w:t xml:space="preserve">${/subsections}</w:t>
+        <w:t xml:space="preserve">${/bibliography_entries}</w:t>
+      </w:r>
+    </w:p>
+    <w:p>
+      <w:r>
+        <w:br w:type="page"/>
+      </w:r>
+    </w:p>
+    <w:p>
+      <w:pPr>
+        <w:pStyle w:val="PrefaceParaTitle"/>
+      </w:pPr>
+      <w:r>
+        <w:rPr>
+          <w:rStyle w:val="PrefaceTitleFont"/>
+        </w:rPr>
+        <w:t xml:space="preserve">ภาคผนวก</w:t>
       </w:r>
     </w:p>
     <w:p>
@@ -688,10 +713,14 @@
       </w:pPr>
     </w:p>
     <w:p>
-      <w:pPr/>
-      <w:r>
-        <w:rPr/>
-        <w:t xml:space="preserve">${/chapters}</w:t>
+      <w:pPr>
+        <w:pStyle w:val="AcademicBody"/>
+      </w:pPr>
+      <w:r>
+        <w:rPr>
+          <w:rStyle w:val="NormalFont"/>
+        </w:rPr>
+        <w:t xml:space="preserve">[ส่วนสำหรับแทรกเนื้อหาภาคผนวก]</w:t>
       </w:r>
     </w:p>
     <w:sectPr>
@@ -726,11 +755,6 @@
   </w:docDefaults>
   <w:style w:type="paragraph" w:default="1" w:styleId="Normal">
     <w:name w:val="Normal"/>
-    <w:pPr>
-      <w:jc w:val="distribute"/>
-      <w:ind w:left="0" w:right="0" w:firstLine="709" w:hanging="0"/>
-      <w:spacing w:line="240" w:lineRule="auto"/>
-    </w:pPr>
   </w:style>
   <w:style w:type="character" w:styleId="FootnoteReference">
     <w:name w:val="Footnote Reference"/>
@@ -739,6 +763,24 @@
     <w:rPr>
       <w:vertAlign w:val="superscript"/>
     </w:rPr>
+  </w:style>
+  <w:style w:type="paragraph" w:customStyle="1" w:styleId="AcademicBody">
+    <w:name w:val="AcademicBody"/>
+    <w:basedOn w:val="Normal"/>
+    <w:pPr>
+      <w:jc w:val="thaiDistribute"/>
+      <w:ind w:left="0" w:right="0" w:firstLine="720" w:hanging="0"/>
+      <w:spacing w:line="240" w:lineRule="auto"/>
+    </w:pPr>
+  </w:style>
+  <w:style w:type="paragraph" w:customStyle="1" w:styleId="AcademicBodyNoIndent">
+    <w:name w:val="AcademicBodyNoIndent"/>
+    <w:basedOn w:val="Normal"/>
+    <w:pPr>
+      <w:jc w:val="thaiDistribute"/>
+      <w:ind w:left="0" w:right="0" w:firstLine="0" w:hanging="0"/>
+      <w:spacing w:line="240" w:lineRule="auto"/>
+    </w:pPr>
   </w:style>
   <w:style w:type="paragraph" w:customStyle="1" w:styleId="Heading1">
     <w:name w:val="Heading1"/>
@@ -804,7 +846,7 @@
       <w:jc w:val="left"/>
       <w:spacing w:line="240" w:lineRule="auto"/>
       <w:tabs>
-        <w:tab w:val="right" w:leader="none" w:pos="8200"/>
+        <w:tab w:val="right" w:leader="none" w:pos="8300"/>
       </w:tabs>
     </w:pPr>
   </w:style>
@@ -816,7 +858,7 @@
       <w:ind w:left="360" w:right="0" w:firstLine="0" w:hanging="0"/>
       <w:spacing w:line="240" w:lineRule="auto"/>
       <w:tabs>
-        <w:tab w:val="right" w:leader="none" w:pos="8200"/>
+        <w:tab w:val="right" w:leader="none" w:pos="8300"/>
       </w:tabs>
     </w:pPr>
   </w:style>

</xml_diff>

<commit_message>
style: standardize thai academic research report formatting for Word and preview
</commit_message>
<xml_diff>
--- a/assets/templates/template_academic_general.docx
+++ b/assets/templates/template_academic_general.docx
@@ -172,7 +172,7 @@
     <w:p>
       <w:pPr>
         <w:sectPr>
-          <w:pgSz w:orient="portrait" w:w="11905.511811023621703498065471649169921875" w:h="16837.7952755905498634092509746551513671875"/>
+          <w:pgSz w:orient="portrait" w:w="11905.511811023622" w:h="16837.79527559055"/>
           <w:pgMar w:top="2160" w:right="1440" w:bottom="1440" w:left="2160" w:header="720" w:footer="720" w:gutter="0"/>
           <w:cols w:num="1" w:space="720"/>
         </w:sectPr>
@@ -348,7 +348,7 @@
     <w:p>
       <w:pPr>
         <w:sectPr>
-          <w:pgSz w:orient="portrait" w:w="11905.511811023621703498065471649169921875" w:h="16837.7952755905498634092509746551513671875"/>
+          <w:pgSz w:orient="portrait" w:w="11905.511811023622" w:h="16837.79527559055"/>
           <w:pgMar w:top="2160" w:right="1440" w:bottom="1440" w:left="2160" w:header="720" w:footer="720" w:gutter="0"/>
           <w:cols w:num="1" w:space="720"/>
         </w:sectPr>
@@ -673,7 +673,6 @@
     <w:p>
       <w:pPr>
         <w:pStyle w:val="AcademicBody"/>
-        <w:ind w:left="720" w:hanging="720"/>
       </w:pPr>
       <w:r>
         <w:rPr>
@@ -725,7 +724,7 @@
       </w:r>
     </w:p>
     <w:sectPr>
-      <w:pgSz w:orient="portrait" w:w="11905.511811023621703498065471649169921875" w:h="16837.7952755905498634092509746551513671875"/>
+      <w:pgSz w:orient="portrait" w:w="11905.511811023622" w:h="16837.79527559055"/>
       <w:pgMar w:top="2160" w:right="1440" w:bottom="1440" w:left="2160" w:header="720" w:footer="720" w:gutter="0"/>
       <w:cols w:num="1" w:space="720"/>
     </w:sectPr>
@@ -847,7 +846,7 @@
       <w:jc w:val="left"/>
       <w:spacing w:line="240" w:lineRule="auto"/>
       <w:tabs>
-        <w:tab w:val="right" w:leader="none" w:pos="8300"/>
+        <w:tab w:val="right" w:leader="none" w:pos="8400"/>
       </w:tabs>
     </w:pPr>
   </w:style>
@@ -859,7 +858,7 @@
       <w:ind w:left="360" w:right="0" w:firstLine="0" w:hanging="0"/>
       <w:spacing w:line="240" w:lineRule="auto"/>
       <w:tabs>
-        <w:tab w:val="right" w:leader="none" w:pos="8300"/>
+        <w:tab w:val="right" w:leader="none" w:pos="8400"/>
       </w:tabs>
     </w:pPr>
   </w:style>

</xml_diff>

<commit_message>
fix: global spacebar-newline issue in Word export and standardized left alignment
</commit_message>
<xml_diff>
--- a/assets/templates/template_academic_general.docx
+++ b/assets/templates/template_academic_general.docx
@@ -172,7 +172,7 @@
     <w:p>
       <w:pPr>
         <w:sectPr>
-          <w:pgSz w:orient="portrait" w:w="11905.511811023622" w:h="16837.79527559055"/>
+          <w:pgSz w:orient="portrait" w:w="11905.511811023621703498065471649169921875" w:h="16837.7952755905498634092509746551513671875"/>
           <w:pgMar w:top="2160" w:right="1440" w:bottom="1440" w:left="2160" w:header="720" w:footer="720" w:gutter="0"/>
           <w:cols w:num="1" w:space="720"/>
         </w:sectPr>
@@ -348,7 +348,7 @@
     <w:p>
       <w:pPr>
         <w:sectPr>
-          <w:pgSz w:orient="portrait" w:w="11905.511811023622" w:h="16837.79527559055"/>
+          <w:pgSz w:orient="portrait" w:w="11905.511811023621703498065471649169921875" w:h="16837.7952755905498634092509746551513671875"/>
           <w:pgMar w:top="2160" w:right="1440" w:bottom="1440" w:left="2160" w:header="720" w:footer="720" w:gutter="0"/>
           <w:cols w:num="1" w:space="720"/>
         </w:sectPr>
@@ -724,7 +724,7 @@
       </w:r>
     </w:p>
     <w:sectPr>
-      <w:pgSz w:orient="portrait" w:w="11905.511811023622" w:h="16837.79527559055"/>
+      <w:pgSz w:orient="portrait" w:w="11905.511811023621703498065471649169921875" w:h="16837.7952755905498634092509746551513671875"/>
       <w:pgMar w:top="2160" w:right="1440" w:bottom="1440" w:left="2160" w:header="720" w:footer="720" w:gutter="0"/>
       <w:cols w:num="1" w:space="720"/>
     </w:sectPr>
@@ -768,7 +768,7 @@
     <w:name w:val="AcademicBody"/>
     <w:basedOn w:val="Normal"/>
     <w:pPr>
-      <w:jc w:val="thaiDistribute"/>
+      <w:jc w:val="left"/>
       <w:ind w:left="0" w:right="0" w:firstLine="720" w:hanging="0"/>
       <w:spacing w:line="240" w:lineRule="auto"/>
     </w:pPr>
@@ -777,7 +777,7 @@
     <w:name w:val="AcademicBodyNoIndent"/>
     <w:basedOn w:val="Normal"/>
     <w:pPr>
-      <w:jc w:val="thaiDistribute"/>
+      <w:jc w:val="left"/>
       <w:ind w:left="0" w:right="0" w:firstLine="0" w:hanging="0"/>
       <w:spacing w:line="240" w:lineRule="auto"/>
     </w:pPr>
@@ -810,7 +810,7 @@
     <w:name w:val="PrefaceParaContent"/>
     <w:basedOn w:val="Normal"/>
     <w:pPr>
-      <w:jc w:val="thaiDistribute"/>
+      <w:jc w:val="left"/>
       <w:ind w:left="0" w:right="0" w:firstLine="720" w:hanging="0"/>
       <w:spacing w:line="240" w:lineRule="auto"/>
     </w:pPr>

</xml_diff>

<commit_message>
feat: complete rewrite of internship report export to be fully programmatic with TH SarabunPSK
</commit_message>
<xml_diff>
--- a/assets/templates/template_academic_general.docx
+++ b/assets/templates/template_academic_general.docx
@@ -172,7 +172,7 @@
     <w:p>
       <w:pPr>
         <w:sectPr>
-          <w:pgSz w:orient="portrait" w:w="11905.511811023621703498065471649169921875" w:h="16837.7952755905498634092509746551513671875"/>
+          <w:pgSz w:orient="portrait" w:w="11905.511811023622" w:h="16837.79527559055"/>
           <w:pgMar w:top="2160" w:right="1440" w:bottom="1440" w:left="2160" w:header="720" w:footer="720" w:gutter="0"/>
           <w:cols w:num="1" w:space="720"/>
         </w:sectPr>
@@ -348,7 +348,7 @@
     <w:p>
       <w:pPr>
         <w:sectPr>
-          <w:pgSz w:orient="portrait" w:w="11905.511811023621703498065471649169921875" w:h="16837.7952755905498634092509746551513671875"/>
+          <w:pgSz w:orient="portrait" w:w="11905.511811023622" w:h="16837.79527559055"/>
           <w:pgMar w:top="2160" w:right="1440" w:bottom="1440" w:left="2160" w:header="720" w:footer="720" w:gutter="0"/>
           <w:cols w:num="1" w:space="720"/>
         </w:sectPr>
@@ -724,7 +724,7 @@
       </w:r>
     </w:p>
     <w:sectPr>
-      <w:pgSz w:orient="portrait" w:w="11905.511811023621703498065471649169921875" w:h="16837.7952755905498634092509746551513671875"/>
+      <w:pgSz w:orient="portrait" w:w="11905.511811023622" w:h="16837.79527559055"/>
       <w:pgMar w:top="2160" w:right="1440" w:bottom="1440" w:left="2160" w:header="720" w:footer="720" w:gutter="0"/>
       <w:cols w:num="1" w:space="720"/>
     </w:sectPr>

</xml_diff>